<commit_message>
Sort an array of 0s, 1s and 2s
</commit_message>
<xml_diff>
--- a/Theory/Dsa problems with the solution.docx
+++ b/Theory/Dsa problems with the solution.docx
@@ -114,7 +114,15 @@
     </w:p>
     <w:p>
       <w:r>
-        <w:t>Paste a screenshot of the problem then answer this 5 question of that problem</w:t>
+        <w:t xml:space="preserve">Paste a screenshot of the problem then answer </w:t>
+      </w:r>
+      <w:proofErr w:type="gramStart"/>
+      <w:r>
+        <w:t>this 5 question</w:t>
+      </w:r>
+      <w:proofErr w:type="gramEnd"/>
+      <w:r>
+        <w:t xml:space="preserve"> of that problem</w:t>
       </w:r>
     </w:p>
     <w:p>
@@ -184,7 +192,17 @@
     </w:p>
     <w:p>
       <w:r>
-        <w:t>My first thought is why cant we use set and put all the unique elements in the set.</w:t>
+        <w:t xml:space="preserve">My first thought is why </w:t>
+      </w:r>
+      <w:proofErr w:type="spellStart"/>
+      <w:proofErr w:type="gramStart"/>
+      <w:r>
+        <w:t>cant</w:t>
+      </w:r>
+      <w:proofErr w:type="spellEnd"/>
+      <w:proofErr w:type="gramEnd"/>
+      <w:r>
+        <w:t xml:space="preserve"> we use set and put all the unique elements in the set.</w:t>
       </w:r>
     </w:p>
     <w:p>
@@ -198,7 +216,15 @@
     <w:p/>
     <w:p>
       <w:r>
-        <w:t>If u do It in place then it the time and space will be O(n) and O(1)</w:t>
+        <w:t xml:space="preserve">If u do It in </w:t>
+      </w:r>
+      <w:proofErr w:type="gramStart"/>
+      <w:r>
+        <w:t>place</w:t>
+      </w:r>
+      <w:proofErr w:type="gramEnd"/>
+      <w:r>
+        <w:t xml:space="preserve"> then it the time and space will be O(n) and O(1)</w:t>
       </w:r>
     </w:p>
     <w:p/>
@@ -207,13 +233,39 @@
         <w:t>This problem pattern is two pointers</w:t>
       </w:r>
       <w:r>
-        <w:t xml:space="preserve">. We are using two pointers because we need to compare the two values and if the the value is different then </w:t>
+        <w:t xml:space="preserve">. We are using two pointers because we need to compare the two values and if the </w:t>
+      </w:r>
+      <w:proofErr w:type="spellStart"/>
+      <w:r>
+        <w:t>the</w:t>
+      </w:r>
+      <w:proofErr w:type="spellEnd"/>
+      <w:r>
+        <w:t xml:space="preserve"> value is different </w:t>
+      </w:r>
+      <w:proofErr w:type="spellStart"/>
+      <w:r>
+        <w:t>then</w:t>
+      </w:r>
+      <w:proofErr w:type="spellEnd"/>
+      <w:r>
+        <w:t xml:space="preserve"> </w:t>
       </w:r>
       <w:r>
         <w:t>replace</w:t>
       </w:r>
       <w:r>
-        <w:t xml:space="preserve">… Since the array is sorted the element which went behind cant come </w:t>
+        <w:t xml:space="preserve">… Since the array is sorted the element which went behind </w:t>
+      </w:r>
+      <w:proofErr w:type="spellStart"/>
+      <w:proofErr w:type="gramStart"/>
+      <w:r>
+        <w:t>cant</w:t>
+      </w:r>
+      <w:proofErr w:type="spellEnd"/>
+      <w:proofErr w:type="gramEnd"/>
+      <w:r>
+        <w:t xml:space="preserve"> come </w:t>
       </w:r>
       <w:r>
         <w:t>future</w:t>
@@ -224,7 +276,25 @@
     </w:p>
     <w:p>
       <w:r>
-        <w:t>In this problem there is no swapping because we don’t need entire array we only need unique elements so we can loose the elements here.</w:t>
+        <w:t xml:space="preserve">In this problem there is no swapping because we don’t need entire </w:t>
+      </w:r>
+      <w:proofErr w:type="gramStart"/>
+      <w:r>
+        <w:t>array</w:t>
+      </w:r>
+      <w:proofErr w:type="gramEnd"/>
+      <w:r>
+        <w:t xml:space="preserve"> we only need unique elements so we can </w:t>
+      </w:r>
+      <w:proofErr w:type="spellStart"/>
+      <w:proofErr w:type="gramStart"/>
+      <w:r>
+        <w:t>loose</w:t>
+      </w:r>
+      <w:proofErr w:type="spellEnd"/>
+      <w:proofErr w:type="gramEnd"/>
+      <w:r>
+        <w:t xml:space="preserve"> the elements here.</w:t>
       </w:r>
     </w:p>
     <w:p>
@@ -232,20 +302,48 @@
         <w:lastRenderedPageBreak/>
         <w:t xml:space="preserve">In this problem need to take j first then </w:t>
       </w:r>
-      <w:r>
-        <w:t>i and not i and j</w:t>
+      <w:proofErr w:type="spellStart"/>
+      <w:r>
+        <w:t>i</w:t>
+      </w:r>
+      <w:proofErr w:type="spellEnd"/>
+      <w:r>
+        <w:t xml:space="preserve"> and not </w:t>
+      </w:r>
+      <w:proofErr w:type="spellStart"/>
+      <w:r>
+        <w:t>i</w:t>
+      </w:r>
+      <w:proofErr w:type="spellEnd"/>
+      <w:r>
+        <w:t xml:space="preserve"> and j</w:t>
       </w:r>
       <w:r>
         <w:t xml:space="preserve">. </w:t>
       </w:r>
       <w:r>
         <w:br/>
-        <w:t>i will keep moving and j will only move if elements are not same.</w:t>
-      </w:r>
-    </w:p>
-    <w:p>
-      <w:r>
-        <w:t>In short one pointer will move only if second pointer finds a different elemet.</w:t>
+      </w:r>
+      <w:proofErr w:type="spellStart"/>
+      <w:r>
+        <w:t>i</w:t>
+      </w:r>
+      <w:proofErr w:type="spellEnd"/>
+      <w:r>
+        <w:t xml:space="preserve"> will keep moving and j will only move if elements are not same.</w:t>
+      </w:r>
+    </w:p>
+    <w:p>
+      <w:r>
+        <w:t xml:space="preserve">In short one pointer will move only if second pointer finds a different </w:t>
+      </w:r>
+      <w:proofErr w:type="spellStart"/>
+      <w:r>
+        <w:t>elemet</w:t>
+      </w:r>
+      <w:proofErr w:type="spellEnd"/>
+      <w:r>
+        <w:t>.</w:t>
       </w:r>
     </w:p>
     <w:p/>
@@ -308,8 +406,13 @@
     </w:p>
     <w:p/>
     <w:p>
-      <w:r>
-        <w:t>First I thought of using shift and push. Why shouldn’t I do that.</w:t>
+      <w:proofErr w:type="gramStart"/>
+      <w:r>
+        <w:t>First</w:t>
+      </w:r>
+      <w:proofErr w:type="gramEnd"/>
+      <w:r>
+        <w:t xml:space="preserve"> I thought of using shift and push. Why shouldn’t I do that.</w:t>
       </w:r>
     </w:p>
     <w:tbl>
@@ -611,6 +714,9 @@
     </w:p>
     <w:p>
       <w:r>
+        <w:rPr>
+          <w:noProof/>
+        </w:rPr>
         <w:drawing>
           <wp:inline distT="0" distB="0" distL="0" distR="0" wp14:anchorId="256F92D1" wp14:editId="2FE5E88E">
             <wp:extent cx="3596185" cy="1450340"/>
@@ -673,7 +779,25 @@
     </w:p>
     <w:p>
       <w:r>
-        <w:t>The number k can be bigger then the length of the array so to fix that we can do k=k%n where n is the length of the array.</w:t>
+        <w:t xml:space="preserve">The number k can be bigger </w:t>
+      </w:r>
+      <w:proofErr w:type="spellStart"/>
+      <w:proofErr w:type="gramStart"/>
+      <w:r>
+        <w:t>then</w:t>
+      </w:r>
+      <w:proofErr w:type="spellEnd"/>
+      <w:proofErr w:type="gramEnd"/>
+      <w:r>
+        <w:t xml:space="preserve"> the length of the array so to fix that we can do k=</w:t>
+      </w:r>
+      <w:proofErr w:type="spellStart"/>
+      <w:r>
+        <w:t>k%n</w:t>
+      </w:r>
+      <w:proofErr w:type="spellEnd"/>
+      <w:r>
+        <w:t xml:space="preserve"> where n is the length of the array.</w:t>
       </w:r>
     </w:p>
     <w:p>
@@ -700,21 +824,43 @@
         <w:t>Mistake</w:t>
       </w:r>
       <w:r>
-        <w:t xml:space="preserve"> : While inserting the temp to array. Careful because the length of temp is just k%n and length of array is n u might add undefined into array.</w:t>
-      </w:r>
-    </w:p>
-    <w:p>
-      <w:r>
-        <w:t>So the loop of inserting should start from 0 to k</w:t>
-      </w:r>
-    </w:p>
-    <w:p>
-      <w:r>
-        <w:rPr>
-          <w:b/>
-          <w:bCs/>
-        </w:rPr>
-        <w:t>Complextity analysis</w:t>
+        <w:t xml:space="preserve"> : While inserting the temp to array. Careful because the length of temp is just </w:t>
+      </w:r>
+      <w:proofErr w:type="spellStart"/>
+      <w:r>
+        <w:t>k%n</w:t>
+      </w:r>
+      <w:proofErr w:type="spellEnd"/>
+      <w:r>
+        <w:t xml:space="preserve"> and length of array is n u might add undefined into array.</w:t>
+      </w:r>
+    </w:p>
+    <w:p>
+      <w:proofErr w:type="gramStart"/>
+      <w:r>
+        <w:t>So</w:t>
+      </w:r>
+      <w:proofErr w:type="gramEnd"/>
+      <w:r>
+        <w:t xml:space="preserve"> the loop of inserting should start from 0 to k</w:t>
+      </w:r>
+    </w:p>
+    <w:p>
+      <w:proofErr w:type="spellStart"/>
+      <w:r>
+        <w:rPr>
+          <w:b/>
+          <w:bCs/>
+        </w:rPr>
+        <w:t>Complextity</w:t>
+      </w:r>
+      <w:proofErr w:type="spellEnd"/>
+      <w:r>
+        <w:rPr>
+          <w:b/>
+          <w:bCs/>
+        </w:rPr>
+        <w:t xml:space="preserve"> analysis</w:t>
       </w:r>
       <w:r>
         <w:br/>
@@ -746,7 +892,15 @@
     </w:p>
     <w:p>
       <w:r>
-        <w:t>Write a reversing function using while loop. Destructuring swap.</w:t>
+        <w:t xml:space="preserve">Write a reversing function using while loop. </w:t>
+      </w:r>
+      <w:proofErr w:type="spellStart"/>
+      <w:r>
+        <w:t>Destructuring</w:t>
+      </w:r>
+      <w:proofErr w:type="spellEnd"/>
+      <w:r>
+        <w:t xml:space="preserve"> swap.</w:t>
       </w:r>
     </w:p>
     <w:p/>
@@ -763,6 +917,9 @@
     </w:p>
     <w:p>
       <w:r>
+        <w:rPr>
+          <w:noProof/>
+        </w:rPr>
         <w:drawing>
           <wp:inline distT="0" distB="0" distL="0" distR="0" wp14:anchorId="18C3FDB4" wp14:editId="6C56EBF8">
             <wp:extent cx="5943600" cy="1683385"/>
@@ -816,8 +973,13 @@
       </w:r>
     </w:p>
     <w:p>
-      <w:r>
-        <w:t>i will start from j+1;</w:t>
+      <w:proofErr w:type="spellStart"/>
+      <w:r>
+        <w:t>i</w:t>
+      </w:r>
+      <w:proofErr w:type="spellEnd"/>
+      <w:r>
+        <w:t xml:space="preserve"> will start from j+1;</w:t>
       </w:r>
     </w:p>
     <w:p>
@@ -843,6 +1005,9 @@
     </w:p>
     <w:p>
       <w:r>
+        <w:rPr>
+          <w:noProof/>
+        </w:rPr>
         <w:drawing>
           <wp:inline distT="0" distB="0" distL="0" distR="0" wp14:anchorId="5882D1A8" wp14:editId="71E6BB65">
             <wp:extent cx="3603009" cy="1660233"/>
@@ -901,7 +1066,23 @@
         </w:numPr>
       </w:pPr>
       <w:r>
-        <w:t>if arr1 element is smaller then put element 1 in the array and increase the index then if arr2 element is smaller then put element of arr2 in the result array and increase that array index. If both of them are equal the put just one and increment both index</w:t>
+        <w:t xml:space="preserve">if arr1 element is smaller </w:t>
+      </w:r>
+      <w:proofErr w:type="gramStart"/>
+      <w:r>
+        <w:t>then</w:t>
+      </w:r>
+      <w:proofErr w:type="gramEnd"/>
+      <w:r>
+        <w:t xml:space="preserve"> put element 1 in the array and increase the index then if arr2 element is smaller </w:t>
+      </w:r>
+      <w:proofErr w:type="gramStart"/>
+      <w:r>
+        <w:t>then</w:t>
+      </w:r>
+      <w:proofErr w:type="gramEnd"/>
+      <w:r>
+        <w:t xml:space="preserve"> put element of arr2 in the result array and increase that array index. If both of them are equal the put just one and increment both index</w:t>
       </w:r>
     </w:p>
     <w:p>
@@ -913,11 +1094,34 @@
         </w:numPr>
       </w:pPr>
       <w:r>
-        <w:t>if any of the array found smaller then other then check</w:t>
+        <w:t xml:space="preserve">if any of the array found smaller </w:t>
+      </w:r>
+      <w:proofErr w:type="spellStart"/>
+      <w:r>
+        <w:t>then</w:t>
+      </w:r>
+      <w:proofErr w:type="spellEnd"/>
+      <w:r>
+        <w:t xml:space="preserve"> other then check</w:t>
       </w:r>
       <w:r>
         <w:br/>
-        <w:t xml:space="preserve">result.length === 0  this is the backup check for result[result.length - 1] on an empty array gives undefined. </w:t>
+      </w:r>
+      <w:proofErr w:type="spellStart"/>
+      <w:r>
+        <w:t>result.length</w:t>
+      </w:r>
+      <w:proofErr w:type="spellEnd"/>
+      <w:r>
+        <w:t xml:space="preserve"> === 0  this is the backup check for result[</w:t>
+      </w:r>
+      <w:proofErr w:type="spellStart"/>
+      <w:r>
+        <w:t>result.length</w:t>
+      </w:r>
+      <w:proofErr w:type="spellEnd"/>
+      <w:r>
+        <w:t xml:space="preserve"> - 1] on an empty array gives undefined. </w:t>
       </w:r>
     </w:p>
     <w:p>
@@ -968,6 +1172,600 @@
       </w:r>
       <w:r>
         <w:t>.</w:t>
+      </w:r>
+    </w:p>
+    <w:p/>
+    <w:p>
+      <w:pPr>
+        <w:rPr>
+          <w:b/>
+          <w:bCs/>
+        </w:rPr>
+      </w:pPr>
+      <w:r>
+        <w:rPr>
+          <w:b/>
+          <w:bCs/>
+        </w:rPr>
+        <w:t xml:space="preserve">Two </w:t>
+      </w:r>
+      <w:proofErr w:type="gramStart"/>
+      <w:r>
+        <w:rPr>
+          <w:b/>
+          <w:bCs/>
+        </w:rPr>
+        <w:t>sum</w:t>
+      </w:r>
+      <w:proofErr w:type="gramEnd"/>
+    </w:p>
+    <w:p>
+      <w:r>
+        <w:rPr>
+          <w:noProof/>
+        </w:rPr>
+        <w:drawing>
+          <wp:inline distT="0" distB="0" distL="0" distR="0" wp14:anchorId="5CFBDA5E" wp14:editId="0149E15F">
+            <wp:extent cx="3690008" cy="1572985"/>
+            <wp:effectExtent l="0" t="0" r="5715" b="8255"/>
+            <wp:docPr id="784973987" name="Picture 1"/>
+            <wp:cNvGraphicFramePr>
+              <a:graphicFrameLocks xmlns:a="http://schemas.openxmlformats.org/drawingml/2006/main" noChangeAspect="1"/>
+            </wp:cNvGraphicFramePr>
+            <a:graphic xmlns:a="http://schemas.openxmlformats.org/drawingml/2006/main">
+              <a:graphicData uri="http://schemas.openxmlformats.org/drawingml/2006/picture">
+                <pic:pic xmlns:pic="http://schemas.openxmlformats.org/drawingml/2006/picture">
+                  <pic:nvPicPr>
+                    <pic:cNvPr id="784973987" name=""/>
+                    <pic:cNvPicPr/>
+                  </pic:nvPicPr>
+                  <pic:blipFill>
+                    <a:blip r:embed="rId10"/>
+                    <a:stretch>
+                      <a:fillRect/>
+                    </a:stretch>
+                  </pic:blipFill>
+                  <pic:spPr>
+                    <a:xfrm>
+                      <a:off x="0" y="0"/>
+                      <a:ext cx="3710507" cy="1581723"/>
+                    </a:xfrm>
+                    <a:prstGeom prst="rect">
+                      <a:avLst/>
+                    </a:prstGeom>
+                  </pic:spPr>
+                </pic:pic>
+              </a:graphicData>
+            </a:graphic>
+          </wp:inline>
+        </w:drawing>
+      </w:r>
+    </w:p>
+    <w:p/>
+    <w:p>
+      <w:pPr>
+        <w:rPr>
+          <w:b/>
+          <w:bCs/>
+        </w:rPr>
+      </w:pPr>
+      <w:r>
+        <w:rPr>
+          <w:b/>
+          <w:bCs/>
+        </w:rPr>
+        <w:t>1</w:t>
+      </w:r>
+      <w:r>
+        <w:rPr>
+          <w:b/>
+          <w:bCs/>
+          <w:vertAlign w:val="superscript"/>
+        </w:rPr>
+        <w:t>st</w:t>
+      </w:r>
+      <w:r>
+        <w:rPr>
+          <w:b/>
+          <w:bCs/>
+        </w:rPr>
+        <w:t xml:space="preserve"> approach</w:t>
+      </w:r>
+    </w:p>
+    <w:p>
+      <w:r>
+        <w:t xml:space="preserve">Take a new result array. </w:t>
+      </w:r>
+    </w:p>
+    <w:p>
+      <w:r>
+        <w:t>Take a temp variable and put target-arr1[</w:t>
+      </w:r>
+      <w:proofErr w:type="spellStart"/>
+      <w:r>
+        <w:t>i</w:t>
+      </w:r>
+      <w:proofErr w:type="spellEnd"/>
+      <w:r>
+        <w:t xml:space="preserve">]. so now u only have to find if there is arr1[j]. </w:t>
+      </w:r>
+      <w:proofErr w:type="gramStart"/>
+      <w:r>
+        <w:t>so</w:t>
+      </w:r>
+      <w:proofErr w:type="gramEnd"/>
+      <w:r>
+        <w:t xml:space="preserve"> u need to find only one value.</w:t>
+      </w:r>
+    </w:p>
+    <w:p>
+      <w:r>
+        <w:t>U need two pointers for this one to find arr1[</w:t>
+      </w:r>
+      <w:proofErr w:type="spellStart"/>
+      <w:r>
+        <w:t>i</w:t>
+      </w:r>
+      <w:proofErr w:type="spellEnd"/>
+      <w:r>
+        <w:t xml:space="preserve">] and other temp. </w:t>
+      </w:r>
+    </w:p>
+    <w:p>
+      <w:r>
+        <w:t xml:space="preserve">Outer loop is needed to find </w:t>
+      </w:r>
+      <w:proofErr w:type="spellStart"/>
+      <w:r>
+        <w:t>arr</w:t>
+      </w:r>
+      <w:proofErr w:type="spellEnd"/>
+      <w:r>
+        <w:t>[</w:t>
+      </w:r>
+      <w:proofErr w:type="spellStart"/>
+      <w:r>
+        <w:t>i</w:t>
+      </w:r>
+      <w:proofErr w:type="spellEnd"/>
+      <w:r>
+        <w:t>] and inner loop is need to find temp.</w:t>
+      </w:r>
+    </w:p>
+    <w:p>
+      <w:r>
+        <w:t xml:space="preserve">As u increment </w:t>
+      </w:r>
+      <w:proofErr w:type="spellStart"/>
+      <w:r>
+        <w:t>i</w:t>
+      </w:r>
+      <w:proofErr w:type="spellEnd"/>
+      <w:r>
+        <w:t xml:space="preserve"> u need to check all the other elements </w:t>
+      </w:r>
+      <w:proofErr w:type="spellStart"/>
+      <w:r>
+        <w:t>everytime</w:t>
+      </w:r>
+      <w:proofErr w:type="spellEnd"/>
+      <w:r>
+        <w:t xml:space="preserve"> to match temp.</w:t>
+      </w:r>
+    </w:p>
+    <w:p/>
+    <w:p>
+      <w:r>
+        <w:t>2</w:t>
+      </w:r>
+      <w:r>
+        <w:rPr>
+          <w:vertAlign w:val="superscript"/>
+        </w:rPr>
+        <w:t>nd</w:t>
+      </w:r>
+      <w:r>
+        <w:t xml:space="preserve"> approach</w:t>
+      </w:r>
+    </w:p>
+    <w:p>
+      <w:proofErr w:type="spellStart"/>
+      <w:r>
+        <w:t>Hashmap</w:t>
+      </w:r>
+      <w:proofErr w:type="spellEnd"/>
+      <w:r>
+        <w:t xml:space="preserve"> approach</w:t>
+      </w:r>
+      <w:r>
+        <w:br/>
+      </w:r>
+      <w:r>
+        <w:t>Using maps. U need a loop</w:t>
+      </w:r>
+      <w:r>
+        <w:t xml:space="preserve"> </w:t>
+      </w:r>
+      <w:proofErr w:type="spellStart"/>
+      <w:r>
+        <w:t>inorder</w:t>
+      </w:r>
+      <w:proofErr w:type="spellEnd"/>
+      <w:r>
+        <w:t xml:space="preserve"> to loop through all the elements once.</w:t>
+      </w:r>
+      <w:r>
+        <w:t xml:space="preserve"> </w:t>
+      </w:r>
+    </w:p>
+    <w:p>
+      <w:r>
+        <w:t xml:space="preserve">When u take </w:t>
+      </w:r>
+      <w:proofErr w:type="spellStart"/>
+      <w:proofErr w:type="gramStart"/>
+      <w:r>
+        <w:t>a</w:t>
+      </w:r>
+      <w:proofErr w:type="spellEnd"/>
+      <w:proofErr w:type="gramEnd"/>
+      <w:r>
+        <w:t xml:space="preserve"> element check if the other half is present in the map. If not present then insert the current element in the map. </w:t>
+      </w:r>
+    </w:p>
+    <w:p>
+      <w:r>
+        <w:t xml:space="preserve">Example. If target is 7 and current is 2. The map is empty. U are searching for element 5. U don’t find it </w:t>
+      </w:r>
+      <w:proofErr w:type="spellStart"/>
+      <w:r>
+        <w:t>obv</w:t>
+      </w:r>
+      <w:proofErr w:type="spellEnd"/>
+      <w:r>
+        <w:t xml:space="preserve"> because the map is empty. Then u insert the current 2 in the map. The next element </w:t>
+      </w:r>
+      <w:r>
+        <w:lastRenderedPageBreak/>
+        <w:t>is 5. So now u need 2. U look in the map BINGO u found two because u inserted 2 in the map last time.</w:t>
+      </w:r>
+      <w:r>
+        <w:t xml:space="preserve"> U found the answer. Return the index of both</w:t>
+      </w:r>
+    </w:p>
+    <w:p/>
+    <w:p>
+      <w:pPr>
+        <w:rPr>
+          <w:b/>
+          <w:bCs/>
+        </w:rPr>
+      </w:pPr>
+      <w:r>
+        <w:rPr>
+          <w:b/>
+          <w:bCs/>
+        </w:rPr>
+        <w:t>Sort an array of 0s, 1s and 2s</w:t>
+      </w:r>
+    </w:p>
+    <w:p>
+      <w:r>
+        <w:drawing>
+          <wp:inline distT="0" distB="0" distL="0" distR="0" wp14:anchorId="4014299C" wp14:editId="5D72774C">
+            <wp:extent cx="4231307" cy="1221474"/>
+            <wp:effectExtent l="0" t="0" r="0" b="0"/>
+            <wp:docPr id="524882442" name="Picture 1"/>
+            <wp:cNvGraphicFramePr>
+              <a:graphicFrameLocks xmlns:a="http://schemas.openxmlformats.org/drawingml/2006/main" noChangeAspect="1"/>
+            </wp:cNvGraphicFramePr>
+            <a:graphic xmlns:a="http://schemas.openxmlformats.org/drawingml/2006/main">
+              <a:graphicData uri="http://schemas.openxmlformats.org/drawingml/2006/picture">
+                <pic:pic xmlns:pic="http://schemas.openxmlformats.org/drawingml/2006/picture">
+                  <pic:nvPicPr>
+                    <pic:cNvPr id="524882442" name=""/>
+                    <pic:cNvPicPr/>
+                  </pic:nvPicPr>
+                  <pic:blipFill>
+                    <a:blip r:embed="rId11"/>
+                    <a:stretch>
+                      <a:fillRect/>
+                    </a:stretch>
+                  </pic:blipFill>
+                  <pic:spPr>
+                    <a:xfrm>
+                      <a:off x="0" y="0"/>
+                      <a:ext cx="4261980" cy="1230329"/>
+                    </a:xfrm>
+                    <a:prstGeom prst="rect">
+                      <a:avLst/>
+                    </a:prstGeom>
+                  </pic:spPr>
+                </pic:pic>
+              </a:graphicData>
+            </a:graphic>
+          </wp:inline>
+        </w:drawing>
+      </w:r>
+    </w:p>
+    <w:p/>
+    <w:p>
+      <w:pPr>
+        <w:rPr>
+          <w:b/>
+          <w:bCs/>
+          <w:sz w:val="28"/>
+          <w:szCs w:val="28"/>
+        </w:rPr>
+      </w:pPr>
+      <w:r>
+        <w:rPr>
+          <w:b/>
+          <w:bCs/>
+          <w:sz w:val="28"/>
+          <w:szCs w:val="28"/>
+        </w:rPr>
+        <w:t>1</w:t>
+      </w:r>
+      <w:r>
+        <w:rPr>
+          <w:b/>
+          <w:bCs/>
+          <w:sz w:val="28"/>
+          <w:szCs w:val="28"/>
+          <w:vertAlign w:val="superscript"/>
+        </w:rPr>
+        <w:t>st</w:t>
+      </w:r>
+      <w:r>
+        <w:rPr>
+          <w:b/>
+          <w:bCs/>
+          <w:sz w:val="28"/>
+          <w:szCs w:val="28"/>
+        </w:rPr>
+        <w:t xml:space="preserve"> approach </w:t>
+      </w:r>
+    </w:p>
+    <w:p>
+      <w:r>
+        <w:t>Use inbuilt sort method. Time complexity O(</w:t>
+      </w:r>
+      <w:proofErr w:type="spellStart"/>
+      <w:r>
+        <w:t>nlogn</w:t>
+      </w:r>
+      <w:proofErr w:type="spellEnd"/>
+      <w:r>
+        <w:t>)</w:t>
+      </w:r>
+    </w:p>
+    <w:p/>
+    <w:p>
+      <w:pPr>
+        <w:rPr>
+          <w:b/>
+          <w:bCs/>
+          <w:sz w:val="28"/>
+          <w:szCs w:val="28"/>
+        </w:rPr>
+      </w:pPr>
+      <w:r>
+        <w:rPr>
+          <w:b/>
+          <w:bCs/>
+          <w:sz w:val="28"/>
+          <w:szCs w:val="28"/>
+        </w:rPr>
+        <w:t>2</w:t>
+      </w:r>
+      <w:r>
+        <w:rPr>
+          <w:b/>
+          <w:bCs/>
+          <w:sz w:val="28"/>
+          <w:szCs w:val="28"/>
+          <w:vertAlign w:val="superscript"/>
+        </w:rPr>
+        <w:t>nd</w:t>
+      </w:r>
+      <w:r>
+        <w:rPr>
+          <w:b/>
+          <w:bCs/>
+          <w:sz w:val="28"/>
+          <w:szCs w:val="28"/>
+        </w:rPr>
+        <w:t xml:space="preserve"> approach</w:t>
+      </w:r>
+    </w:p>
+    <w:p>
+      <w:r>
+        <w:t xml:space="preserve">Use the 3 counters. One counter for each. Then override the original array with those counters </w:t>
+      </w:r>
+      <w:proofErr w:type="spellStart"/>
+      <w:r>
+        <w:t>inorder</w:t>
+      </w:r>
+      <w:proofErr w:type="spellEnd"/>
+      <w:r>
+        <w:t xml:space="preserve"> 0 , 1 and 2. We manually sorted the array</w:t>
+      </w:r>
+    </w:p>
+    <w:p>
+      <w:r>
+        <w:t xml:space="preserve">Time </w:t>
+      </w:r>
+      <w:proofErr w:type="spellStart"/>
+      <w:r>
+        <w:t>complexity:O</w:t>
+      </w:r>
+      <w:proofErr w:type="spellEnd"/>
+      <w:r>
+        <w:t>(n)  and Space complexity O(1)</w:t>
+      </w:r>
+    </w:p>
+    <w:p/>
+    <w:p>
+      <w:pPr>
+        <w:rPr>
+          <w:b/>
+          <w:bCs/>
+          <w:sz w:val="28"/>
+          <w:szCs w:val="28"/>
+        </w:rPr>
+      </w:pPr>
+      <w:r>
+        <w:rPr>
+          <w:b/>
+          <w:bCs/>
+          <w:sz w:val="28"/>
+          <w:szCs w:val="28"/>
+        </w:rPr>
+        <w:t>3</w:t>
+      </w:r>
+      <w:r>
+        <w:rPr>
+          <w:b/>
+          <w:bCs/>
+          <w:sz w:val="28"/>
+          <w:szCs w:val="28"/>
+          <w:vertAlign w:val="superscript"/>
+        </w:rPr>
+        <w:t>rd</w:t>
+      </w:r>
+      <w:r>
+        <w:rPr>
+          <w:b/>
+          <w:bCs/>
+          <w:sz w:val="28"/>
+          <w:szCs w:val="28"/>
+        </w:rPr>
+        <w:t xml:space="preserve"> approach</w:t>
+      </w:r>
+    </w:p>
+    <w:p>
+      <w:r>
+        <w:t>T</w:t>
+      </w:r>
+      <w:r>
+        <w:t>hree pointers approach</w:t>
+      </w:r>
+      <w:r>
+        <w:t>.</w:t>
+      </w:r>
+      <w:r>
+        <w:t xml:space="preserve"> (low, mid , high)</w:t>
+      </w:r>
+    </w:p>
+    <w:p>
+      <w:r>
+        <w:rPr>
+          <w:b/>
+          <w:bCs/>
+        </w:rPr>
+        <w:t>Low</w:t>
+      </w:r>
+      <w:r>
+        <w:t xml:space="preserve"> -&gt; </w:t>
+      </w:r>
+      <w:r>
+        <w:t>S</w:t>
+      </w:r>
+      <w:r>
+        <w:t>tands where the next 0 should be placed.</w:t>
+      </w:r>
+    </w:p>
+    <w:p>
+      <w:r>
+        <w:rPr>
+          <w:b/>
+          <w:bCs/>
+        </w:rPr>
+        <w:t>Mid</w:t>
+      </w:r>
+      <w:r>
+        <w:t xml:space="preserve"> -&gt; </w:t>
+      </w:r>
+      <w:r>
+        <w:t>T</w:t>
+      </w:r>
+      <w:r>
+        <w:t>he inspector . Looks at each box and decides what to do.</w:t>
+      </w:r>
+    </w:p>
+    <w:p>
+      <w:r>
+        <w:rPr>
+          <w:b/>
+          <w:bCs/>
+        </w:rPr>
+        <w:t>High</w:t>
+      </w:r>
+      <w:r>
+        <w:t xml:space="preserve"> -&gt; </w:t>
+      </w:r>
+      <w:r>
+        <w:t>S</w:t>
+      </w:r>
+      <w:r>
+        <w:t>tands where the next 2 should be placed.</w:t>
+      </w:r>
+    </w:p>
+    <w:p>
+      <w:r>
+        <w:t>The only 3 rules</w:t>
+      </w:r>
+    </w:p>
+    <w:p>
+      <w:r>
+        <w:t>Rule 1: mid sees a 0</w:t>
+      </w:r>
+    </w:p>
+    <w:p>
+      <w:r>
+        <w:t>Swap it with where low is standing. Move both low and mid one step right.</w:t>
+      </w:r>
+    </w:p>
+    <w:p/>
+    <w:p>
+      <w:r>
+        <w:lastRenderedPageBreak/>
+        <w:t>Rule 2:mid sees a 1</w:t>
+      </w:r>
+    </w:p>
+    <w:p>
+      <w:r>
+        <w:t>Do nothing must move one step right.</w:t>
+      </w:r>
+    </w:p>
+    <w:p>
+      <w:r>
+        <w:t>Rule 3: mid sees a 2</w:t>
+      </w:r>
+    </w:p>
+    <w:p>
+      <w:r>
+        <w:t>Swap with where the high is standing and move the high one step left</w:t>
+      </w:r>
+      <w:r>
+        <w:t>.</w:t>
+      </w:r>
+      <w:r>
+        <w:t xml:space="preserve"> Don’t move mid.</w:t>
+      </w:r>
+    </w:p>
+    <w:p>
+      <w:r>
+        <w:t xml:space="preserve">( because u got </w:t>
+      </w:r>
+      <w:proofErr w:type="gramStart"/>
+      <w:r>
+        <w:t>a</w:t>
+      </w:r>
+      <w:proofErr w:type="gramEnd"/>
+      <w:r>
+        <w:t xml:space="preserve"> unknown in the mid u have to check it again)</w:t>
       </w:r>
     </w:p>
     <w:sectPr>
@@ -1096,6 +1894,118 @@
     </w:lvl>
   </w:abstractNum>
   <w:abstractNum w:abstractNumId="1" w15:restartNumberingAfterBreak="0">
+    <w:nsid w:val="63EB0A88"/>
+    <w:multiLevelType w:val="hybridMultilevel"/>
+    <w:tmpl w:val="42D8A9E2"/>
+    <w:lvl w:ilvl="0" w:tplc="1A906CD2">
+      <w:numFmt w:val="bullet"/>
+      <w:lvlText w:val=""/>
+      <w:lvlJc w:val="left"/>
+      <w:pPr>
+        <w:ind w:left="720" w:hanging="360"/>
+      </w:pPr>
+      <w:rPr>
+        <w:rFonts w:ascii="Wingdings" w:eastAsiaTheme="minorHAnsi" w:hAnsi="Wingdings" w:cstheme="minorBidi" w:hint="default"/>
+      </w:rPr>
+    </w:lvl>
+    <w:lvl w:ilvl="1" w:tplc="04090003" w:tentative="1">
+      <w:start w:val="1"/>
+      <w:numFmt w:val="bullet"/>
+      <w:lvlText w:val="o"/>
+      <w:lvlJc w:val="left"/>
+      <w:pPr>
+        <w:ind w:left="1440" w:hanging="360"/>
+      </w:pPr>
+      <w:rPr>
+        <w:rFonts w:ascii="Courier New" w:hAnsi="Courier New" w:cs="Courier New" w:hint="default"/>
+      </w:rPr>
+    </w:lvl>
+    <w:lvl w:ilvl="2" w:tplc="04090005" w:tentative="1">
+      <w:start w:val="1"/>
+      <w:numFmt w:val="bullet"/>
+      <w:lvlText w:val=""/>
+      <w:lvlJc w:val="left"/>
+      <w:pPr>
+        <w:ind w:left="2160" w:hanging="360"/>
+      </w:pPr>
+      <w:rPr>
+        <w:rFonts w:ascii="Wingdings" w:hAnsi="Wingdings" w:hint="default"/>
+      </w:rPr>
+    </w:lvl>
+    <w:lvl w:ilvl="3" w:tplc="04090001" w:tentative="1">
+      <w:start w:val="1"/>
+      <w:numFmt w:val="bullet"/>
+      <w:lvlText w:val=""/>
+      <w:lvlJc w:val="left"/>
+      <w:pPr>
+        <w:ind w:left="2880" w:hanging="360"/>
+      </w:pPr>
+      <w:rPr>
+        <w:rFonts w:ascii="Symbol" w:hAnsi="Symbol" w:hint="default"/>
+      </w:rPr>
+    </w:lvl>
+    <w:lvl w:ilvl="4" w:tplc="04090003" w:tentative="1">
+      <w:start w:val="1"/>
+      <w:numFmt w:val="bullet"/>
+      <w:lvlText w:val="o"/>
+      <w:lvlJc w:val="left"/>
+      <w:pPr>
+        <w:ind w:left="3600" w:hanging="360"/>
+      </w:pPr>
+      <w:rPr>
+        <w:rFonts w:ascii="Courier New" w:hAnsi="Courier New" w:cs="Courier New" w:hint="default"/>
+      </w:rPr>
+    </w:lvl>
+    <w:lvl w:ilvl="5" w:tplc="04090005" w:tentative="1">
+      <w:start w:val="1"/>
+      <w:numFmt w:val="bullet"/>
+      <w:lvlText w:val=""/>
+      <w:lvlJc w:val="left"/>
+      <w:pPr>
+        <w:ind w:left="4320" w:hanging="360"/>
+      </w:pPr>
+      <w:rPr>
+        <w:rFonts w:ascii="Wingdings" w:hAnsi="Wingdings" w:hint="default"/>
+      </w:rPr>
+    </w:lvl>
+    <w:lvl w:ilvl="6" w:tplc="04090001" w:tentative="1">
+      <w:start w:val="1"/>
+      <w:numFmt w:val="bullet"/>
+      <w:lvlText w:val=""/>
+      <w:lvlJc w:val="left"/>
+      <w:pPr>
+        <w:ind w:left="5040" w:hanging="360"/>
+      </w:pPr>
+      <w:rPr>
+        <w:rFonts w:ascii="Symbol" w:hAnsi="Symbol" w:hint="default"/>
+      </w:rPr>
+    </w:lvl>
+    <w:lvl w:ilvl="7" w:tplc="04090003" w:tentative="1">
+      <w:start w:val="1"/>
+      <w:numFmt w:val="bullet"/>
+      <w:lvlText w:val="o"/>
+      <w:lvlJc w:val="left"/>
+      <w:pPr>
+        <w:ind w:left="5760" w:hanging="360"/>
+      </w:pPr>
+      <w:rPr>
+        <w:rFonts w:ascii="Courier New" w:hAnsi="Courier New" w:cs="Courier New" w:hint="default"/>
+      </w:rPr>
+    </w:lvl>
+    <w:lvl w:ilvl="8" w:tplc="04090005" w:tentative="1">
+      <w:start w:val="1"/>
+      <w:numFmt w:val="bullet"/>
+      <w:lvlText w:val=""/>
+      <w:lvlJc w:val="left"/>
+      <w:pPr>
+        <w:ind w:left="6480" w:hanging="360"/>
+      </w:pPr>
+      <w:rPr>
+        <w:rFonts w:ascii="Wingdings" w:hAnsi="Wingdings" w:hint="default"/>
+      </w:rPr>
+    </w:lvl>
+  </w:abstractNum>
+  <w:abstractNum w:abstractNumId="2" w15:restartNumberingAfterBreak="0">
     <w:nsid w:val="683035E9"/>
     <w:multiLevelType w:val="hybridMultilevel"/>
     <w:tmpl w:val="F11E8C48"/>
@@ -1212,6 +2122,9 @@
     <w:abstractNumId w:val="0"/>
   </w:num>
   <w:num w:numId="2" w16cid:durableId="1877082637">
+    <w:abstractNumId w:val="2"/>
+  </w:num>
+  <w:num w:numId="3" w16cid:durableId="1916433492">
     <w:abstractNumId w:val="1"/>
   </w:num>
 </w:numbering>

</xml_diff>

<commit_message>
Find the Majority Element that occurs more than N/2 times
</commit_message>
<xml_diff>
--- a/Theory/Dsa problems with the solution.docx
+++ b/Theory/Dsa problems with the solution.docx
@@ -114,15 +114,7 @@
     </w:p>
     <w:p>
       <w:r>
-        <w:t xml:space="preserve">Paste a screenshot of the problem then answer </w:t>
-      </w:r>
-      <w:proofErr w:type="gramStart"/>
-      <w:r>
-        <w:t>this 5 question</w:t>
-      </w:r>
-      <w:proofErr w:type="gramEnd"/>
-      <w:r>
-        <w:t xml:space="preserve"> of that problem</w:t>
+        <w:t>Paste a screenshot of the problem then answer this 5 question of that problem</w:t>
       </w:r>
     </w:p>
     <w:p>
@@ -192,17 +184,7 @@
     </w:p>
     <w:p>
       <w:r>
-        <w:t xml:space="preserve">My first thought is why </w:t>
-      </w:r>
-      <w:proofErr w:type="spellStart"/>
-      <w:proofErr w:type="gramStart"/>
-      <w:r>
-        <w:t>cant</w:t>
-      </w:r>
-      <w:proofErr w:type="spellEnd"/>
-      <w:proofErr w:type="gramEnd"/>
-      <w:r>
-        <w:t xml:space="preserve"> we use set and put all the unique elements in the set.</w:t>
+        <w:t>My first thought is why cant we use set and put all the unique elements in the set.</w:t>
       </w:r>
     </w:p>
     <w:p>
@@ -216,15 +198,7 @@
     <w:p/>
     <w:p>
       <w:r>
-        <w:t xml:space="preserve">If u do It in </w:t>
-      </w:r>
-      <w:proofErr w:type="gramStart"/>
-      <w:r>
-        <w:t>place</w:t>
-      </w:r>
-      <w:proofErr w:type="gramEnd"/>
-      <w:r>
-        <w:t xml:space="preserve"> then it the time and space will be O(n) and O(1)</w:t>
+        <w:t>If u do It in place then it the time and space will be O(n) and O(1)</w:t>
       </w:r>
     </w:p>
     <w:p/>
@@ -233,39 +207,13 @@
         <w:t>This problem pattern is two pointers</w:t>
       </w:r>
       <w:r>
-        <w:t xml:space="preserve">. We are using two pointers because we need to compare the two values and if the </w:t>
-      </w:r>
-      <w:proofErr w:type="spellStart"/>
-      <w:r>
-        <w:t>the</w:t>
-      </w:r>
-      <w:proofErr w:type="spellEnd"/>
-      <w:r>
-        <w:t xml:space="preserve"> value is different </w:t>
-      </w:r>
-      <w:proofErr w:type="spellStart"/>
-      <w:r>
-        <w:t>then</w:t>
-      </w:r>
-      <w:proofErr w:type="spellEnd"/>
-      <w:r>
-        <w:t xml:space="preserve"> </w:t>
+        <w:t xml:space="preserve">. We are using two pointers because we need to compare the two values and if the the value is different then </w:t>
       </w:r>
       <w:r>
         <w:t>replace</w:t>
       </w:r>
       <w:r>
-        <w:t xml:space="preserve">… Since the array is sorted the element which went behind </w:t>
-      </w:r>
-      <w:proofErr w:type="spellStart"/>
-      <w:proofErr w:type="gramStart"/>
-      <w:r>
-        <w:t>cant</w:t>
-      </w:r>
-      <w:proofErr w:type="spellEnd"/>
-      <w:proofErr w:type="gramEnd"/>
-      <w:r>
-        <w:t xml:space="preserve"> come </w:t>
+        <w:t xml:space="preserve">… Since the array is sorted the element which went behind cant come </w:t>
       </w:r>
       <w:r>
         <w:t>future</w:t>
@@ -276,25 +224,7 @@
     </w:p>
     <w:p>
       <w:r>
-        <w:t xml:space="preserve">In this problem there is no swapping because we don’t need entire </w:t>
-      </w:r>
-      <w:proofErr w:type="gramStart"/>
-      <w:r>
-        <w:t>array</w:t>
-      </w:r>
-      <w:proofErr w:type="gramEnd"/>
-      <w:r>
-        <w:t xml:space="preserve"> we only need unique elements so we can </w:t>
-      </w:r>
-      <w:proofErr w:type="spellStart"/>
-      <w:proofErr w:type="gramStart"/>
-      <w:r>
-        <w:t>loose</w:t>
-      </w:r>
-      <w:proofErr w:type="spellEnd"/>
-      <w:proofErr w:type="gramEnd"/>
-      <w:r>
-        <w:t xml:space="preserve"> the elements here.</w:t>
+        <w:t>In this problem there is no swapping because we don’t need entire array we only need unique elements so we can loose the elements here.</w:t>
       </w:r>
     </w:p>
     <w:p>
@@ -302,48 +232,20 @@
         <w:lastRenderedPageBreak/>
         <w:t xml:space="preserve">In this problem need to take j first then </w:t>
       </w:r>
-      <w:proofErr w:type="spellStart"/>
-      <w:r>
-        <w:t>i</w:t>
-      </w:r>
-      <w:proofErr w:type="spellEnd"/>
-      <w:r>
-        <w:t xml:space="preserve"> and not </w:t>
-      </w:r>
-      <w:proofErr w:type="spellStart"/>
-      <w:r>
-        <w:t>i</w:t>
-      </w:r>
-      <w:proofErr w:type="spellEnd"/>
-      <w:r>
-        <w:t xml:space="preserve"> and j</w:t>
+      <w:r>
+        <w:t>i and not i and j</w:t>
       </w:r>
       <w:r>
         <w:t xml:space="preserve">. </w:t>
       </w:r>
       <w:r>
         <w:br/>
-      </w:r>
-      <w:proofErr w:type="spellStart"/>
-      <w:r>
-        <w:t>i</w:t>
-      </w:r>
-      <w:proofErr w:type="spellEnd"/>
-      <w:r>
-        <w:t xml:space="preserve"> will keep moving and j will only move if elements are not same.</w:t>
-      </w:r>
-    </w:p>
-    <w:p>
-      <w:r>
-        <w:t xml:space="preserve">In short one pointer will move only if second pointer finds a different </w:t>
-      </w:r>
-      <w:proofErr w:type="spellStart"/>
-      <w:r>
-        <w:t>elemet</w:t>
-      </w:r>
-      <w:proofErr w:type="spellEnd"/>
-      <w:r>
-        <w:t>.</w:t>
+        <w:t>i will keep moving and j will only move if elements are not same.</w:t>
+      </w:r>
+    </w:p>
+    <w:p>
+      <w:r>
+        <w:t>In short one pointer will move only if second pointer finds a different elemet.</w:t>
       </w:r>
     </w:p>
     <w:p/>
@@ -406,13 +308,8 @@
     </w:p>
     <w:p/>
     <w:p>
-      <w:proofErr w:type="gramStart"/>
-      <w:r>
-        <w:t>First</w:t>
-      </w:r>
-      <w:proofErr w:type="gramEnd"/>
-      <w:r>
-        <w:t xml:space="preserve"> I thought of using shift and push. Why shouldn’t I do that.</w:t>
+      <w:r>
+        <w:t>First I thought of using shift and push. Why shouldn’t I do that.</w:t>
       </w:r>
     </w:p>
     <w:tbl>
@@ -779,25 +676,7 @@
     </w:p>
     <w:p>
       <w:r>
-        <w:t xml:space="preserve">The number k can be bigger </w:t>
-      </w:r>
-      <w:proofErr w:type="spellStart"/>
-      <w:proofErr w:type="gramStart"/>
-      <w:r>
-        <w:t>then</w:t>
-      </w:r>
-      <w:proofErr w:type="spellEnd"/>
-      <w:proofErr w:type="gramEnd"/>
-      <w:r>
-        <w:t xml:space="preserve"> the length of the array so to fix that we can do k=</w:t>
-      </w:r>
-      <w:proofErr w:type="spellStart"/>
-      <w:r>
-        <w:t>k%n</w:t>
-      </w:r>
-      <w:proofErr w:type="spellEnd"/>
-      <w:r>
-        <w:t xml:space="preserve"> where n is the length of the array.</w:t>
+        <w:t>The number k can be bigger then the length of the array so to fix that we can do k=k%n where n is the length of the array.</w:t>
       </w:r>
     </w:p>
     <w:p>
@@ -824,43 +703,21 @@
         <w:t>Mistake</w:t>
       </w:r>
       <w:r>
-        <w:t xml:space="preserve"> : While inserting the temp to array. Careful because the length of temp is just </w:t>
-      </w:r>
-      <w:proofErr w:type="spellStart"/>
-      <w:r>
-        <w:t>k%n</w:t>
-      </w:r>
-      <w:proofErr w:type="spellEnd"/>
-      <w:r>
-        <w:t xml:space="preserve"> and length of array is n u might add undefined into array.</w:t>
-      </w:r>
-    </w:p>
-    <w:p>
-      <w:proofErr w:type="gramStart"/>
-      <w:r>
-        <w:t>So</w:t>
-      </w:r>
-      <w:proofErr w:type="gramEnd"/>
-      <w:r>
-        <w:t xml:space="preserve"> the loop of inserting should start from 0 to k</w:t>
-      </w:r>
-    </w:p>
-    <w:p>
-      <w:proofErr w:type="spellStart"/>
-      <w:r>
-        <w:rPr>
-          <w:b/>
-          <w:bCs/>
-        </w:rPr>
-        <w:t>Complextity</w:t>
-      </w:r>
-      <w:proofErr w:type="spellEnd"/>
-      <w:r>
-        <w:rPr>
-          <w:b/>
-          <w:bCs/>
-        </w:rPr>
-        <w:t xml:space="preserve"> analysis</w:t>
+        <w:t xml:space="preserve"> : While inserting the temp to array. Careful because the length of temp is just k%n and length of array is n u might add undefined into array.</w:t>
+      </w:r>
+    </w:p>
+    <w:p>
+      <w:r>
+        <w:t>So the loop of inserting should start from 0 to k</w:t>
+      </w:r>
+    </w:p>
+    <w:p>
+      <w:r>
+        <w:rPr>
+          <w:b/>
+          <w:bCs/>
+        </w:rPr>
+        <w:t>Complextity analysis</w:t>
       </w:r>
       <w:r>
         <w:br/>
@@ -892,15 +749,7 @@
     </w:p>
     <w:p>
       <w:r>
-        <w:t xml:space="preserve">Write a reversing function using while loop. </w:t>
-      </w:r>
-      <w:proofErr w:type="spellStart"/>
-      <w:r>
-        <w:t>Destructuring</w:t>
-      </w:r>
-      <w:proofErr w:type="spellEnd"/>
-      <w:r>
-        <w:t xml:space="preserve"> swap.</w:t>
+        <w:t>Write a reversing function using while loop. Destructuring swap.</w:t>
       </w:r>
     </w:p>
     <w:p/>
@@ -973,13 +822,8 @@
       </w:r>
     </w:p>
     <w:p>
-      <w:proofErr w:type="spellStart"/>
-      <w:r>
-        <w:t>i</w:t>
-      </w:r>
-      <w:proofErr w:type="spellEnd"/>
-      <w:r>
-        <w:t xml:space="preserve"> will start from j+1;</w:t>
+      <w:r>
+        <w:t>i will start from j+1;</w:t>
       </w:r>
     </w:p>
     <w:p>
@@ -1066,23 +910,7 @@
         </w:numPr>
       </w:pPr>
       <w:r>
-        <w:t xml:space="preserve">if arr1 element is smaller </w:t>
-      </w:r>
-      <w:proofErr w:type="gramStart"/>
-      <w:r>
-        <w:t>then</w:t>
-      </w:r>
-      <w:proofErr w:type="gramEnd"/>
-      <w:r>
-        <w:t xml:space="preserve"> put element 1 in the array and increase the index then if arr2 element is smaller </w:t>
-      </w:r>
-      <w:proofErr w:type="gramStart"/>
-      <w:r>
-        <w:t>then</w:t>
-      </w:r>
-      <w:proofErr w:type="gramEnd"/>
-      <w:r>
-        <w:t xml:space="preserve"> put element of arr2 in the result array and increase that array index. If both of them are equal the put just one and increment both index</w:t>
+        <w:t>if arr1 element is smaller then put element 1 in the array and increase the index then if arr2 element is smaller then put element of arr2 in the result array and increase that array index. If both of them are equal the put just one and increment both index</w:t>
       </w:r>
     </w:p>
     <w:p>
@@ -1094,34 +922,11 @@
         </w:numPr>
       </w:pPr>
       <w:r>
-        <w:t xml:space="preserve">if any of the array found smaller </w:t>
-      </w:r>
-      <w:proofErr w:type="spellStart"/>
-      <w:r>
-        <w:t>then</w:t>
-      </w:r>
-      <w:proofErr w:type="spellEnd"/>
-      <w:r>
-        <w:t xml:space="preserve"> other then check</w:t>
+        <w:t>if any of the array found smaller then other then check</w:t>
       </w:r>
       <w:r>
         <w:br/>
-      </w:r>
-      <w:proofErr w:type="spellStart"/>
-      <w:r>
-        <w:t>result.length</w:t>
-      </w:r>
-      <w:proofErr w:type="spellEnd"/>
-      <w:r>
-        <w:t xml:space="preserve"> === 0  this is the backup check for result[</w:t>
-      </w:r>
-      <w:proofErr w:type="spellStart"/>
-      <w:r>
-        <w:t>result.length</w:t>
-      </w:r>
-      <w:proofErr w:type="spellEnd"/>
-      <w:r>
-        <w:t xml:space="preserve"> - 1] on an empty array gives undefined. </w:t>
+        <w:t xml:space="preserve">result.length === 0  this is the backup check for result[result.length - 1] on an empty array gives undefined. </w:t>
       </w:r>
     </w:p>
     <w:p>
@@ -1187,17 +992,8 @@
           <w:b/>
           <w:bCs/>
         </w:rPr>
-        <w:t xml:space="preserve">Two </w:t>
-      </w:r>
-      <w:proofErr w:type="gramStart"/>
-      <w:r>
-        <w:rPr>
-          <w:b/>
-          <w:bCs/>
-        </w:rPr>
-        <w:t>sum</w:t>
-      </w:r>
-      <w:proofErr w:type="gramEnd"/>
+        <w:t>Two sum</w:t>
+      </w:r>
     </w:p>
     <w:p>
       <w:r>
@@ -1279,78 +1075,22 @@
     </w:p>
     <w:p>
       <w:r>
-        <w:t>Take a temp variable and put target-arr1[</w:t>
-      </w:r>
-      <w:proofErr w:type="spellStart"/>
-      <w:r>
-        <w:t>i</w:t>
-      </w:r>
-      <w:proofErr w:type="spellEnd"/>
-      <w:r>
-        <w:t xml:space="preserve">]. so now u only have to find if there is arr1[j]. </w:t>
-      </w:r>
-      <w:proofErr w:type="gramStart"/>
-      <w:r>
-        <w:t>so</w:t>
-      </w:r>
-      <w:proofErr w:type="gramEnd"/>
-      <w:r>
-        <w:t xml:space="preserve"> u need to find only one value.</w:t>
-      </w:r>
-    </w:p>
-    <w:p>
-      <w:r>
-        <w:t>U need two pointers for this one to find arr1[</w:t>
-      </w:r>
-      <w:proofErr w:type="spellStart"/>
-      <w:r>
-        <w:t>i</w:t>
-      </w:r>
-      <w:proofErr w:type="spellEnd"/>
-      <w:r>
-        <w:t xml:space="preserve">] and other temp. </w:t>
-      </w:r>
-    </w:p>
-    <w:p>
-      <w:r>
-        <w:t xml:space="preserve">Outer loop is needed to find </w:t>
-      </w:r>
-      <w:proofErr w:type="spellStart"/>
-      <w:r>
-        <w:t>arr</w:t>
-      </w:r>
-      <w:proofErr w:type="spellEnd"/>
-      <w:r>
-        <w:t>[</w:t>
-      </w:r>
-      <w:proofErr w:type="spellStart"/>
-      <w:r>
-        <w:t>i</w:t>
-      </w:r>
-      <w:proofErr w:type="spellEnd"/>
-      <w:r>
-        <w:t>] and inner loop is need to find temp.</w:t>
-      </w:r>
-    </w:p>
-    <w:p>
-      <w:r>
-        <w:t xml:space="preserve">As u increment </w:t>
-      </w:r>
-      <w:proofErr w:type="spellStart"/>
-      <w:r>
-        <w:t>i</w:t>
-      </w:r>
-      <w:proofErr w:type="spellEnd"/>
-      <w:r>
-        <w:t xml:space="preserve"> u need to check all the other elements </w:t>
-      </w:r>
-      <w:proofErr w:type="spellStart"/>
-      <w:r>
-        <w:t>everytime</w:t>
-      </w:r>
-      <w:proofErr w:type="spellEnd"/>
-      <w:r>
-        <w:t xml:space="preserve"> to match temp.</w:t>
+        <w:t>Take a temp variable and put target-arr1[i]. so now u only have to find if there is arr1[j]. so u need to find only one value.</w:t>
+      </w:r>
+    </w:p>
+    <w:p>
+      <w:r>
+        <w:t xml:space="preserve">U need two pointers for this one to find arr1[i] and other temp. </w:t>
+      </w:r>
+    </w:p>
+    <w:p>
+      <w:r>
+        <w:t>Outer loop is needed to find arr[i] and inner loop is need to find temp.</w:t>
+      </w:r>
+    </w:p>
+    <w:p>
+      <w:r>
+        <w:t>As u increment i u need to check all the other elements everytime to match temp.</w:t>
       </w:r>
     </w:p>
     <w:p/>
@@ -1369,13 +1109,8 @@
       </w:r>
     </w:p>
     <w:p>
-      <w:proofErr w:type="spellStart"/>
-      <w:r>
-        <w:t>Hashmap</w:t>
-      </w:r>
-      <w:proofErr w:type="spellEnd"/>
-      <w:r>
-        <w:t xml:space="preserve"> approach</w:t>
+      <w:r>
+        <w:t>Hashmap approach</w:t>
       </w:r>
       <w:r>
         <w:br/>
@@ -1384,46 +1119,20 @@
         <w:t>Using maps. U need a loop</w:t>
       </w:r>
       <w:r>
+        <w:t xml:space="preserve"> inorder to loop through all the elements once.</w:t>
+      </w:r>
+      <w:r>
         <w:t xml:space="preserve"> </w:t>
       </w:r>
-      <w:proofErr w:type="spellStart"/>
-      <w:r>
-        <w:t>inorder</w:t>
-      </w:r>
-      <w:proofErr w:type="spellEnd"/>
-      <w:r>
-        <w:t xml:space="preserve"> to loop through all the elements once.</w:t>
-      </w:r>
-      <w:r>
-        <w:t xml:space="preserve"> </w:t>
-      </w:r>
-    </w:p>
-    <w:p>
-      <w:r>
-        <w:t xml:space="preserve">When u take </w:t>
-      </w:r>
-      <w:proofErr w:type="spellStart"/>
-      <w:proofErr w:type="gramStart"/>
-      <w:r>
-        <w:t>a</w:t>
-      </w:r>
-      <w:proofErr w:type="spellEnd"/>
-      <w:proofErr w:type="gramEnd"/>
-      <w:r>
-        <w:t xml:space="preserve"> element check if the other half is present in the map. If not present then insert the current element in the map. </w:t>
-      </w:r>
-    </w:p>
-    <w:p>
-      <w:r>
-        <w:t xml:space="preserve">Example. If target is 7 and current is 2. The map is empty. U are searching for element 5. U don’t find it </w:t>
-      </w:r>
-      <w:proofErr w:type="spellStart"/>
-      <w:r>
-        <w:t>obv</w:t>
-      </w:r>
-      <w:proofErr w:type="spellEnd"/>
-      <w:r>
-        <w:t xml:space="preserve"> because the map is empty. Then u insert the current 2 in the map. The next element </w:t>
+    </w:p>
+    <w:p>
+      <w:r>
+        <w:t xml:space="preserve">When u take a element check if the other half is present in the map. If not present then insert the current element in the map. </w:t>
+      </w:r>
+    </w:p>
+    <w:p>
+      <w:r>
+        <w:t xml:space="preserve">Example. If target is 7 and current is 2. The map is empty. U are searching for element 5. U don’t find it obv because the map is empty. Then u insert the current 2 in the map. The next element </w:t>
       </w:r>
       <w:r>
         <w:lastRenderedPageBreak/>
@@ -1451,6 +1160,9 @@
     </w:p>
     <w:p>
       <w:r>
+        <w:rPr>
+          <w:noProof/>
+        </w:rPr>
         <w:drawing>
           <wp:inline distT="0" distB="0" distL="0" distR="0" wp14:anchorId="4014299C" wp14:editId="5D72774C">
             <wp:extent cx="4231307" cy="1221474"/>
@@ -1529,15 +1241,7 @@
     </w:p>
     <w:p>
       <w:r>
-        <w:t>Use inbuilt sort method. Time complexity O(</w:t>
-      </w:r>
-      <w:proofErr w:type="spellStart"/>
-      <w:r>
-        <w:t>nlogn</w:t>
-      </w:r>
-      <w:proofErr w:type="spellEnd"/>
-      <w:r>
-        <w:t>)</w:t>
+        <w:t>Use inbuilt sort method. Time complexity O(nlogn)</w:t>
       </w:r>
     </w:p>
     <w:p/>
@@ -1581,28 +1285,12 @@
     </w:p>
     <w:p>
       <w:r>
-        <w:t xml:space="preserve">Use the 3 counters. One counter for each. Then override the original array with those counters </w:t>
-      </w:r>
-      <w:proofErr w:type="spellStart"/>
-      <w:r>
-        <w:t>inorder</w:t>
-      </w:r>
-      <w:proofErr w:type="spellEnd"/>
-      <w:r>
-        <w:t xml:space="preserve"> 0 , 1 and 2. We manually sorted the array</w:t>
-      </w:r>
-    </w:p>
-    <w:p>
-      <w:r>
-        <w:t xml:space="preserve">Time </w:t>
-      </w:r>
-      <w:proofErr w:type="spellStart"/>
-      <w:r>
-        <w:t>complexity:O</w:t>
-      </w:r>
-      <w:proofErr w:type="spellEnd"/>
-      <w:r>
-        <w:t>(n)  and Space complexity O(1)</w:t>
+        <w:t>Use the 3 counters. One counter for each. Then override the original array with those counters inorder 0 , 1 and 2. We manually sorted the array</w:t>
+      </w:r>
+    </w:p>
+    <w:p>
+      <w:r>
+        <w:t>Time complexity:O(n)  and Space complexity O(1)</w:t>
       </w:r>
     </w:p>
     <w:p/>
@@ -1757,15 +1445,260 @@
     </w:p>
     <w:p>
       <w:r>
-        <w:t xml:space="preserve">( because u got </w:t>
-      </w:r>
-      <w:proofErr w:type="gramStart"/>
-      <w:r>
-        <w:t>a</w:t>
-      </w:r>
-      <w:proofErr w:type="gramEnd"/>
-      <w:r>
-        <w:t xml:space="preserve"> unknown in the mid u have to check it again)</w:t>
+        <w:t>( because u got a unknown in the mid u have to check it again)</w:t>
+      </w:r>
+      <w:r>
+        <w:br/>
+      </w:r>
+    </w:p>
+    <w:p>
+      <w:pPr>
+        <w:rPr>
+          <w:b/>
+          <w:bCs/>
+        </w:rPr>
+      </w:pPr>
+      <w:r>
+        <w:rPr>
+          <w:b/>
+          <w:bCs/>
+        </w:rPr>
+        <w:t>Sudo code</w:t>
+      </w:r>
+    </w:p>
+    <w:p>
+      <w:r>
+        <w:t>If(mid===0)</w:t>
+      </w:r>
+    </w:p>
+    <w:p>
+      <w:r>
+        <w:t>Swap with low</w:t>
+      </w:r>
+    </w:p>
+    <w:p>
+      <w:r>
+        <w:t>Low++;</w:t>
+      </w:r>
+    </w:p>
+    <w:p>
+      <w:r>
+        <w:t>High++</w:t>
+      </w:r>
+    </w:p>
+    <w:p>
+      <w:r>
+        <w:t>Else if mid ===1</w:t>
+      </w:r>
+    </w:p>
+    <w:p>
+      <w:r>
+        <w:t>Mid++;</w:t>
+      </w:r>
+    </w:p>
+    <w:p>
+      <w:r>
+        <w:t xml:space="preserve">Else </w:t>
+      </w:r>
+    </w:p>
+    <w:p>
+      <w:r>
+        <w:t>Swap high with mid</w:t>
+      </w:r>
+    </w:p>
+    <w:p>
+      <w:r>
+        <w:t>High--;</w:t>
+      </w:r>
+    </w:p>
+    <w:p/>
+    <w:p>
+      <w:pPr>
+        <w:rPr>
+          <w:b/>
+          <w:bCs/>
+        </w:rPr>
+      </w:pPr>
+    </w:p>
+    <w:p>
+      <w:pPr>
+        <w:rPr>
+          <w:b/>
+          <w:bCs/>
+        </w:rPr>
+      </w:pPr>
+    </w:p>
+    <w:p>
+      <w:pPr>
+        <w:rPr>
+          <w:b/>
+          <w:bCs/>
+        </w:rPr>
+      </w:pPr>
+    </w:p>
+    <w:p>
+      <w:pPr>
+        <w:rPr>
+          <w:b/>
+          <w:bCs/>
+        </w:rPr>
+      </w:pPr>
+    </w:p>
+    <w:p>
+      <w:pPr>
+        <w:rPr>
+          <w:b/>
+          <w:bCs/>
+        </w:rPr>
+      </w:pPr>
+    </w:p>
+    <w:p>
+      <w:pPr>
+        <w:rPr>
+          <w:b/>
+          <w:bCs/>
+        </w:rPr>
+      </w:pPr>
+    </w:p>
+    <w:p>
+      <w:pPr>
+        <w:rPr>
+          <w:b/>
+          <w:bCs/>
+        </w:rPr>
+      </w:pPr>
+    </w:p>
+    <w:p>
+      <w:pPr>
+        <w:rPr>
+          <w:b/>
+          <w:bCs/>
+        </w:rPr>
+      </w:pPr>
+    </w:p>
+    <w:p>
+      <w:pPr>
+        <w:rPr>
+          <w:b/>
+          <w:bCs/>
+        </w:rPr>
+      </w:pPr>
+    </w:p>
+    <w:p>
+      <w:pPr>
+        <w:rPr>
+          <w:b/>
+          <w:bCs/>
+          <w:sz w:val="32"/>
+          <w:szCs w:val="32"/>
+        </w:rPr>
+      </w:pPr>
+      <w:r>
+        <w:rPr>
+          <w:b/>
+          <w:bCs/>
+          <w:sz w:val="32"/>
+          <w:szCs w:val="32"/>
+        </w:rPr>
+        <w:lastRenderedPageBreak/>
+        <w:t>Find the Majority Element that occurs more than N/2 times</w:t>
+      </w:r>
+    </w:p>
+    <w:p>
+      <w:r>
+        <w:drawing>
+          <wp:inline distT="0" distB="0" distL="0" distR="0" wp14:anchorId="0C889BE0" wp14:editId="5A952ACE">
+            <wp:extent cx="6377505" cy="1906438"/>
+            <wp:effectExtent l="0" t="0" r="4445" b="0"/>
+            <wp:docPr id="1767141566" name="Picture 1"/>
+            <wp:cNvGraphicFramePr>
+              <a:graphicFrameLocks xmlns:a="http://schemas.openxmlformats.org/drawingml/2006/main" noChangeAspect="1"/>
+            </wp:cNvGraphicFramePr>
+            <a:graphic xmlns:a="http://schemas.openxmlformats.org/drawingml/2006/main">
+              <a:graphicData uri="http://schemas.openxmlformats.org/drawingml/2006/picture">
+                <pic:pic xmlns:pic="http://schemas.openxmlformats.org/drawingml/2006/picture">
+                  <pic:nvPicPr>
+                    <pic:cNvPr id="1767141566" name=""/>
+                    <pic:cNvPicPr/>
+                  </pic:nvPicPr>
+                  <pic:blipFill>
+                    <a:blip r:embed="rId12"/>
+                    <a:stretch>
+                      <a:fillRect/>
+                    </a:stretch>
+                  </pic:blipFill>
+                  <pic:spPr>
+                    <a:xfrm>
+                      <a:off x="0" y="0"/>
+                      <a:ext cx="6444560" cy="1926483"/>
+                    </a:xfrm>
+                    <a:prstGeom prst="rect">
+                      <a:avLst/>
+                    </a:prstGeom>
+                  </pic:spPr>
+                </pic:pic>
+              </a:graphicData>
+            </a:graphic>
+          </wp:inline>
+        </w:drawing>
+      </w:r>
+    </w:p>
+    <w:p>
+      <w:r>
+        <w:drawing>
+          <wp:inline distT="0" distB="0" distL="0" distR="0" wp14:anchorId="079745AE" wp14:editId="24580236">
+            <wp:extent cx="5745192" cy="2012659"/>
+            <wp:effectExtent l="0" t="0" r="8255" b="6985"/>
+            <wp:docPr id="1945440131" name="Picture 1"/>
+            <wp:cNvGraphicFramePr>
+              <a:graphicFrameLocks xmlns:a="http://schemas.openxmlformats.org/drawingml/2006/main" noChangeAspect="1"/>
+            </wp:cNvGraphicFramePr>
+            <a:graphic xmlns:a="http://schemas.openxmlformats.org/drawingml/2006/main">
+              <a:graphicData uri="http://schemas.openxmlformats.org/drawingml/2006/picture">
+                <pic:pic xmlns:pic="http://schemas.openxmlformats.org/drawingml/2006/picture">
+                  <pic:nvPicPr>
+                    <pic:cNvPr id="1945440131" name=""/>
+                    <pic:cNvPicPr/>
+                  </pic:nvPicPr>
+                  <pic:blipFill>
+                    <a:blip r:embed="rId13"/>
+                    <a:stretch>
+                      <a:fillRect/>
+                    </a:stretch>
+                  </pic:blipFill>
+                  <pic:spPr>
+                    <a:xfrm>
+                      <a:off x="0" y="0"/>
+                      <a:ext cx="5852592" cy="2050283"/>
+                    </a:xfrm>
+                    <a:prstGeom prst="rect">
+                      <a:avLst/>
+                    </a:prstGeom>
+                  </pic:spPr>
+                </pic:pic>
+              </a:graphicData>
+            </a:graphic>
+          </wp:inline>
+        </w:drawing>
+      </w:r>
+    </w:p>
+    <w:p/>
+    <w:p>
+      <w:r>
+        <w:t>Take two counters.</w:t>
+      </w:r>
+    </w:p>
+    <w:p>
+      <w:r>
+        <w:t xml:space="preserve">Count for counting occurance and candidate for </w:t>
+      </w:r>
+      <w:r>
+        <w:t>the element which we are counting.</w:t>
+      </w:r>
+    </w:p>
+    <w:p>
+      <w:r>
+        <w:t>If count of current candidate goes to zero then we will change the candidate.</w:t>
       </w:r>
     </w:p>
     <w:sectPr>

</xml_diff>